<commit_message>
Version 1.1 Minor fixes
</commit_message>
<xml_diff>
--- a/CIS152 - Final Report.docx
+++ b/CIS152 - Final Report.docx
@@ -25,23 +25,25 @@
     </w:p>
     <w:p>
       <w:r>
-        <w:t xml:space="preserve">Substitution manager will use a stack for players currently in the game and a queue for players waiting to enter the game. The coach sets the program up by entering all player names and setting his substitution intervals (2 minutes, 3 minutes, </w:t>
-      </w:r>
-      <w:proofErr w:type="spellStart"/>
-      <w:r>
-        <w:t>ect</w:t>
-      </w:r>
-      <w:proofErr w:type="spellEnd"/>
-      <w:r>
-        <w:t xml:space="preserve">.). Then, the coach can select which players entered the game for who. The queue of players on the bench is then sorted based on who has the least </w:t>
-      </w:r>
-      <w:proofErr w:type="gramStart"/>
-      <w:r>
-        <w:t>amount</w:t>
-      </w:r>
-      <w:proofErr w:type="gramEnd"/>
-      <w:r>
-        <w:t xml:space="preserve"> of minutes.</w:t>
+        <w:t xml:space="preserve">Substitution manager will use </w:t>
+      </w:r>
+      <w:r>
+        <w:t xml:space="preserve">a </w:t>
+      </w:r>
+      <w:r>
+        <w:t>linked</w:t>
+      </w:r>
+      <w:r>
+        <w:t xml:space="preserve"> list</w:t>
+      </w:r>
+      <w:r>
+        <w:t xml:space="preserve"> for players currently in the game and a queue for players waiting to enter the game. </w:t>
+      </w:r>
+      <w:r>
+        <w:t>The coach can then make substitutions at any point in the game and the program can accurately track the player’s minutes.</w:t>
+      </w:r>
+      <w:r>
+        <w:t xml:space="preserve"> The queue of players on the bench is then sorted based on who has the least amount of minutes.</w:t>
       </w:r>
       <w:r>
         <w:br/>
@@ -180,8 +182,35 @@
     </w:p>
     <w:p>
       <w:r>
-        <w:t>I would say the scope of my project stayed relatively close to how I imagined it. I wanted to be able to create your own roster and make substitutions while tracking the time played. I then decided to add target minutes for each player to know for sure how many minutes each player should play. The only major blocker I had was I wanted the first data structure to be a stack. I had to change it to a linked list so I could search through it to make substitutions. Other than that, I just had to learn some more elements of java fx.</w:t>
-      </w:r>
+        <w:t xml:space="preserve">I would say the scope of my project stayed relatively close to how I imagined it. I wanted to be able to create your own roster and make substitutions while tracking the time played. I then decided to add target minutes for each player to know for sure how many minutes each player should play. The only major blocker I had was I wanted the first data structure to be a stack. I had to change it to a linked list so I could search through it to make substitutions. Other than that, I just had to learn some more elements of java </w:t>
+      </w:r>
+      <w:proofErr w:type="spellStart"/>
+      <w:r>
+        <w:t>fx</w:t>
+      </w:r>
+      <w:proofErr w:type="spellEnd"/>
+      <w:r>
+        <w:t>.</w:t>
+      </w:r>
+    </w:p>
+    <w:p/>
+    <w:p>
+      <w:pPr>
+        <w:pStyle w:val="Heading1"/>
+      </w:pPr>
+      <w:r>
+        <w:t>GitHub Repository</w:t>
+      </w:r>
+    </w:p>
+    <w:p>
+      <w:hyperlink r:id="rId4" w:history="1">
+        <w:r>
+          <w:rPr>
+            <w:rStyle w:val="Hyperlink"/>
+          </w:rPr>
+          <w:t>https://github.com/BurnsCaleb/Substitution-Manager---CIS152</w:t>
+        </w:r>
+      </w:hyperlink>
     </w:p>
     <w:p/>
     <w:p>
@@ -245,7 +274,11 @@
         <w:t>Select a Saved Roster</w:t>
       </w:r>
       <w:r>
-        <w:t xml:space="preserve">. There are three default rosters already available. If you create a new roster, you will be able to input up to 15 players. Note the first 5 players on the roster are default starters. Otherwise, you can select one of the saved rosters. Once you select a roster, you will have to enter the </w:t>
+        <w:t xml:space="preserve">. There are three default rosters already available. If you create a new roster, you will be able to input up to 15 players. Note the first 5 players on the roster are default starters. Otherwise, you can select </w:t>
+      </w:r>
+      <w:r>
+        <w:lastRenderedPageBreak/>
+        <w:t xml:space="preserve">one of the saved rosters. Once you select a roster, you will have to enter the </w:t>
       </w:r>
       <w:r>
         <w:rPr>
@@ -279,7 +312,6 @@
         <w:pStyle w:val="Heading2"/>
       </w:pPr>
       <w:r>
-        <w:lastRenderedPageBreak/>
         <w:t>Making a Substitution</w:t>
       </w:r>
     </w:p>
@@ -346,15 +378,7 @@
         <w:t>functions</w:t>
       </w:r>
       <w:r>
-        <w:t xml:space="preserve"> and variable names also </w:t>
-      </w:r>
-      <w:proofErr w:type="gramStart"/>
-      <w:r>
-        <w:t>help</w:t>
-      </w:r>
-      <w:proofErr w:type="gramEnd"/>
-      <w:r>
-        <w:t xml:space="preserve"> others as well as yourself understand what is going on. Programs should also be able to handle invalid inputs in all cases.</w:t>
+        <w:t xml:space="preserve"> and variable names also help others as well as yourself understand what is going on. Programs should also be able to handle invalid inputs in all cases.</w:t>
       </w:r>
     </w:p>
     <w:p/>
@@ -1326,6 +1350,29 @@
       <w:spacing w:val="5"/>
     </w:rPr>
   </w:style>
+  <w:style w:type="character" w:styleId="Hyperlink">
+    <w:name w:val="Hyperlink"/>
+    <w:basedOn w:val="DefaultParagraphFont"/>
+    <w:uiPriority w:val="99"/>
+    <w:unhideWhenUsed/>
+    <w:rsid w:val="001D2E58"/>
+    <w:rPr>
+      <w:color w:val="467886" w:themeColor="hyperlink"/>
+      <w:u w:val="single"/>
+    </w:rPr>
+  </w:style>
+  <w:style w:type="character" w:styleId="UnresolvedMention">
+    <w:name w:val="Unresolved Mention"/>
+    <w:basedOn w:val="DefaultParagraphFont"/>
+    <w:uiPriority w:val="99"/>
+    <w:semiHidden/>
+    <w:unhideWhenUsed/>
+    <w:rsid w:val="001D2E58"/>
+    <w:rPr>
+      <w:color w:val="605E5C"/>
+      <w:shd w:val="clear" w:color="auto" w:fill="E1DFDD"/>
+    </w:rPr>
+  </w:style>
 </w:styles>
 </file>
 

</xml_diff>